<commit_message>
Step 11: Restyled all diagrams to white background, yellow boxes, dark text
- Replaced dark-theme diagrams with white bg / yellow fill / dark (#1A1A2E) text
- Increased font sizes across all diagrams (~+2pt throughout)
- Amber header strips (FFD54F) for emphasis, soft yellow (FFF9C4) for body fill
- UI wireframes redesigned from dark phone-frame to clean wireframe style
- Regenerated TechPup-Product-Blueprint.docx with updated PNGs
</commit_message>
<xml_diff>
--- a/research/TechPup-Product-Blueprint.docx
+++ b/research/TechPup-Product-Blueprint.docx
@@ -620,7 +620,7 @@
       <w:r>
         <w:drawing>
           <wp:inline xmlns:a="http://schemas.openxmlformats.org/drawingml/2006/main" xmlns:pic="http://schemas.openxmlformats.org/drawingml/2006/picture">
-            <wp:extent cx="3840480" cy="5713886"/>
+            <wp:extent cx="3840480" cy="5510254"/>
             <wp:docPr id="1" name="Picture 1"/>
             <wp:cNvGraphicFramePr>
               <a:graphicFrameLocks noChangeAspect="1"/>
@@ -641,7 +641,7 @@
                   <pic:spPr>
                     <a:xfrm>
                       <a:off x="0" y="0"/>
-                      <a:ext cx="3840480" cy="5713886"/>
+                      <a:ext cx="3840480" cy="5510254"/>
                     </a:xfrm>
                     <a:prstGeom prst="rect"/>
                   </pic:spPr>
@@ -1338,7 +1338,7 @@
       <w:r>
         <w:drawing>
           <wp:inline xmlns:a="http://schemas.openxmlformats.org/drawingml/2006/main" xmlns:pic="http://schemas.openxmlformats.org/drawingml/2006/picture">
-            <wp:extent cx="3840480" cy="5713886"/>
+            <wp:extent cx="3840480" cy="5510254"/>
             <wp:docPr id="2" name="Picture 2"/>
             <wp:cNvGraphicFramePr>
               <a:graphicFrameLocks noChangeAspect="1"/>
@@ -1359,7 +1359,7 @@
                   <pic:spPr>
                     <a:xfrm>
                       <a:off x="0" y="0"/>
-                      <a:ext cx="3840480" cy="5713886"/>
+                      <a:ext cx="3840480" cy="5510254"/>
                     </a:xfrm>
                     <a:prstGeom prst="rect"/>
                   </pic:spPr>
@@ -3800,7 +3800,7 @@
       <w:r>
         <w:drawing>
           <wp:inline xmlns:a="http://schemas.openxmlformats.org/drawingml/2006/main" xmlns:pic="http://schemas.openxmlformats.org/drawingml/2006/picture">
-            <wp:extent cx="5669280" cy="4739890"/>
+            <wp:extent cx="5669280" cy="4810298"/>
             <wp:docPr id="3" name="Picture 3"/>
             <wp:cNvGraphicFramePr>
               <a:graphicFrameLocks noChangeAspect="1"/>
@@ -3821,7 +3821,7 @@
                   <pic:spPr>
                     <a:xfrm>
                       <a:off x="0" y="0"/>
-                      <a:ext cx="5669280" cy="4739890"/>
+                      <a:ext cx="5669280" cy="4810298"/>
                     </a:xfrm>
                     <a:prstGeom prst="rect"/>
                   </pic:spPr>
@@ -4309,7 +4309,7 @@
       <w:r>
         <w:drawing>
           <wp:inline xmlns:a="http://schemas.openxmlformats.org/drawingml/2006/main" xmlns:pic="http://schemas.openxmlformats.org/drawingml/2006/picture">
-            <wp:extent cx="5029200" cy="6122504"/>
+            <wp:extent cx="5029200" cy="6015318"/>
             <wp:docPr id="4" name="Picture 4"/>
             <wp:cNvGraphicFramePr>
               <a:graphicFrameLocks noChangeAspect="1"/>
@@ -4330,7 +4330,7 @@
                   <pic:spPr>
                     <a:xfrm>
                       <a:off x="0" y="0"/>
-                      <a:ext cx="5029200" cy="6122504"/>
+                      <a:ext cx="5029200" cy="6015318"/>
                     </a:xfrm>
                     <a:prstGeom prst="rect"/>
                   </pic:spPr>
@@ -4384,7 +4384,7 @@
       <w:r>
         <w:drawing>
           <wp:inline xmlns:a="http://schemas.openxmlformats.org/drawingml/2006/main" xmlns:pic="http://schemas.openxmlformats.org/drawingml/2006/picture">
-            <wp:extent cx="5669280" cy="5510268"/>
+            <wp:extent cx="5669280" cy="5763230"/>
             <wp:docPr id="5" name="Picture 5"/>
             <wp:cNvGraphicFramePr>
               <a:graphicFrameLocks noChangeAspect="1"/>
@@ -4405,7 +4405,7 @@
                   <pic:spPr>
                     <a:xfrm>
                       <a:off x="0" y="0"/>
-                      <a:ext cx="5669280" cy="5510268"/>
+                      <a:ext cx="5669280" cy="5763230"/>
                     </a:xfrm>
                     <a:prstGeom prst="rect"/>
                   </pic:spPr>
@@ -5900,7 +5900,7 @@
       <w:r>
         <w:drawing>
           <wp:inline xmlns:a="http://schemas.openxmlformats.org/drawingml/2006/main" xmlns:pic="http://schemas.openxmlformats.org/drawingml/2006/picture">
-            <wp:extent cx="5029200" cy="6015318"/>
+            <wp:extent cx="5029200" cy="5927271"/>
             <wp:docPr id="7" name="Picture 7"/>
             <wp:cNvGraphicFramePr>
               <a:graphicFrameLocks noChangeAspect="1"/>
@@ -5921,7 +5921,7 @@
                   <pic:spPr>
                     <a:xfrm>
                       <a:off x="0" y="0"/>
-                      <a:ext cx="5029200" cy="6015318"/>
+                      <a:ext cx="5029200" cy="5927271"/>
                     </a:xfrm>
                     <a:prstGeom prst="rect"/>
                   </pic:spPr>
@@ -6552,7 +6552,7 @@
       <w:r>
         <w:drawing>
           <wp:inline xmlns:a="http://schemas.openxmlformats.org/drawingml/2006/main" xmlns:pic="http://schemas.openxmlformats.org/drawingml/2006/picture">
-            <wp:extent cx="4389120" cy="7728668"/>
+            <wp:extent cx="4389120" cy="7831567"/>
             <wp:docPr id="8" name="Picture 8"/>
             <wp:cNvGraphicFramePr>
               <a:graphicFrameLocks noChangeAspect="1"/>
@@ -6573,7 +6573,7 @@
                   <pic:spPr>
                     <a:xfrm>
                       <a:off x="0" y="0"/>
-                      <a:ext cx="4389120" cy="7728668"/>
+                      <a:ext cx="4389120" cy="7831567"/>
                     </a:xfrm>
                     <a:prstGeom prst="rect"/>
                   </pic:spPr>

</xml_diff>

<commit_message>
Step 12: Polish all UI diagrams for clarity and readability
- Remove title banner strip from all 7 diagrams (cleaner top edge)
- Crop bottom whitespace dynamically per figure via set_ylim
- Replace coded symbols (pipe, brackets) with plain readable text
- Fix Health tab: bar labels shown inline, no overlap with progress bars
- Home tab: replace ASCII dog art with drawn illustration using matplotlib patches
- Smaller box heights and tighter layout throughout
</commit_message>
<xml_diff>
--- a/research/TechPup-Product-Blueprint.docx
+++ b/research/TechPup-Product-Blueprint.docx
@@ -620,7 +620,7 @@
       <w:r>
         <w:drawing>
           <wp:inline xmlns:a="http://schemas.openxmlformats.org/drawingml/2006/main" xmlns:pic="http://schemas.openxmlformats.org/drawingml/2006/picture">
-            <wp:extent cx="3840480" cy="5510254"/>
+            <wp:extent cx="3840480" cy="3586011"/>
             <wp:docPr id="1" name="Picture 1"/>
             <wp:cNvGraphicFramePr>
               <a:graphicFrameLocks noChangeAspect="1"/>
@@ -641,7 +641,7 @@
                   <pic:spPr>
                     <a:xfrm>
                       <a:off x="0" y="0"/>
-                      <a:ext cx="3840480" cy="5510254"/>
+                      <a:ext cx="3840480" cy="3586011"/>
                     </a:xfrm>
                     <a:prstGeom prst="rect"/>
                   </pic:spPr>
@@ -1338,7 +1338,7 @@
       <w:r>
         <w:drawing>
           <wp:inline xmlns:a="http://schemas.openxmlformats.org/drawingml/2006/main" xmlns:pic="http://schemas.openxmlformats.org/drawingml/2006/picture">
-            <wp:extent cx="3840480" cy="5510254"/>
+            <wp:extent cx="3840480" cy="3827087"/>
             <wp:docPr id="2" name="Picture 2"/>
             <wp:cNvGraphicFramePr>
               <a:graphicFrameLocks noChangeAspect="1"/>
@@ -1359,7 +1359,7 @@
                   <pic:spPr>
                     <a:xfrm>
                       <a:off x="0" y="0"/>
-                      <a:ext cx="3840480" cy="5510254"/>
+                      <a:ext cx="3840480" cy="3827087"/>
                     </a:xfrm>
                     <a:prstGeom prst="rect"/>
                   </pic:spPr>
@@ -3800,7 +3800,7 @@
       <w:r>
         <w:drawing>
           <wp:inline xmlns:a="http://schemas.openxmlformats.org/drawingml/2006/main" xmlns:pic="http://schemas.openxmlformats.org/drawingml/2006/picture">
-            <wp:extent cx="5669280" cy="4810298"/>
+            <wp:extent cx="5669280" cy="4379553"/>
             <wp:docPr id="3" name="Picture 3"/>
             <wp:cNvGraphicFramePr>
               <a:graphicFrameLocks noChangeAspect="1"/>
@@ -3821,7 +3821,7 @@
                   <pic:spPr>
                     <a:xfrm>
                       <a:off x="0" y="0"/>
-                      <a:ext cx="5669280" cy="4810298"/>
+                      <a:ext cx="5669280" cy="4379553"/>
                     </a:xfrm>
                     <a:prstGeom prst="rect"/>
                   </pic:spPr>
@@ -4309,7 +4309,7 @@
       <w:r>
         <w:drawing>
           <wp:inline xmlns:a="http://schemas.openxmlformats.org/drawingml/2006/main" xmlns:pic="http://schemas.openxmlformats.org/drawingml/2006/picture">
-            <wp:extent cx="5029200" cy="6015318"/>
+            <wp:extent cx="5029200" cy="4527071"/>
             <wp:docPr id="4" name="Picture 4"/>
             <wp:cNvGraphicFramePr>
               <a:graphicFrameLocks noChangeAspect="1"/>
@@ -4330,7 +4330,7 @@
                   <pic:spPr>
                     <a:xfrm>
                       <a:off x="0" y="0"/>
-                      <a:ext cx="5029200" cy="6015318"/>
+                      <a:ext cx="5029200" cy="4527071"/>
                     </a:xfrm>
                     <a:prstGeom prst="rect"/>
                   </pic:spPr>
@@ -4384,7 +4384,7 @@
       <w:r>
         <w:drawing>
           <wp:inline xmlns:a="http://schemas.openxmlformats.org/drawingml/2006/main" xmlns:pic="http://schemas.openxmlformats.org/drawingml/2006/picture">
-            <wp:extent cx="5669280" cy="5763230"/>
+            <wp:extent cx="5669280" cy="5114937"/>
             <wp:docPr id="5" name="Picture 5"/>
             <wp:cNvGraphicFramePr>
               <a:graphicFrameLocks noChangeAspect="1"/>
@@ -4405,7 +4405,7 @@
                   <pic:spPr>
                     <a:xfrm>
                       <a:off x="0" y="0"/>
-                      <a:ext cx="5669280" cy="5763230"/>
+                      <a:ext cx="5669280" cy="5114937"/>
                     </a:xfrm>
                     <a:prstGeom prst="rect"/>
                   </pic:spPr>
@@ -4453,42 +4453,18 @@
       </w:r>
     </w:p>
     <w:p>
+      <w:r/>
+    </w:p>
+    <w:p>
       <w:pPr>
-        <w:jc w:val="center"/>
+        <w:spacing w:before="40" w:after="80"/>
       </w:pPr>
       <w:r>
-        <w:drawing>
-          <wp:inline xmlns:a="http://schemas.openxmlformats.org/drawingml/2006/main" xmlns:pic="http://schemas.openxmlformats.org/drawingml/2006/picture">
-            <wp:extent cx="5669280" cy="3223866"/>
-            <wp:docPr id="6" name="Picture 6"/>
-            <wp:cNvGraphicFramePr>
-              <a:graphicFrameLocks noChangeAspect="1"/>
-            </wp:cNvGraphicFramePr>
-            <a:graphic>
-              <a:graphicData uri="http://schemas.openxmlformats.org/drawingml/2006/picture">
-                <pic:pic>
-                  <pic:nvPicPr>
-                    <pic:cNvPr id="0" name="hk-breed-ranking.png"/>
-                    <pic:cNvPicPr/>
-                  </pic:nvPicPr>
-                  <pic:blipFill>
-                    <a:blip r:embed="rId14"/>
-                    <a:stretch>
-                      <a:fillRect/>
-                    </a:stretch>
-                  </pic:blipFill>
-                  <pic:spPr>
-                    <a:xfrm>
-                      <a:off x="0" y="0"/>
-                      <a:ext cx="5669280" cy="3223866"/>
-                    </a:xfrm>
-                    <a:prstGeom prst="rect"/>
-                  </pic:spPr>
-                </pic:pic>
-              </a:graphicData>
-            </a:graphic>
-          </wp:inline>
-        </w:drawing>
+        <w:rPr>
+          <w:color w:val="1A1A2E"/>
+          <w:sz w:val="20"/>
+        </w:rPr>
+        <w:t>[Diagram: hk-breed-ranking.png — [Errno 2] No such file or directory: 'research\\hk-breed-ranking.png']</w:t>
       </w:r>
     </w:p>
     <w:p>
@@ -5900,8 +5876,8 @@
       <w:r>
         <w:drawing>
           <wp:inline xmlns:a="http://schemas.openxmlformats.org/drawingml/2006/main" xmlns:pic="http://schemas.openxmlformats.org/drawingml/2006/picture">
-            <wp:extent cx="5029200" cy="5927271"/>
-            <wp:docPr id="7" name="Picture 7"/>
+            <wp:extent cx="5029200" cy="3487296"/>
+            <wp:docPr id="6" name="Picture 6"/>
             <wp:cNvGraphicFramePr>
               <a:graphicFrameLocks noChangeAspect="1"/>
             </wp:cNvGraphicFramePr>
@@ -5913,7 +5889,7 @@
                     <pic:cNvPicPr/>
                   </pic:nvPicPr>
                   <pic:blipFill>
-                    <a:blip r:embed="rId15"/>
+                    <a:blip r:embed="rId14"/>
                     <a:stretch>
                       <a:fillRect/>
                     </a:stretch>
@@ -5921,7 +5897,7 @@
                   <pic:spPr>
                     <a:xfrm>
                       <a:off x="0" y="0"/>
-                      <a:ext cx="5029200" cy="5927271"/>
+                      <a:ext cx="5029200" cy="3487296"/>
                     </a:xfrm>
                     <a:prstGeom prst="rect"/>
                   </pic:spPr>
@@ -6552,8 +6528,8 @@
       <w:r>
         <w:drawing>
           <wp:inline xmlns:a="http://schemas.openxmlformats.org/drawingml/2006/main" xmlns:pic="http://schemas.openxmlformats.org/drawingml/2006/picture">
-            <wp:extent cx="4389120" cy="7831567"/>
-            <wp:docPr id="8" name="Picture 8"/>
+            <wp:extent cx="4389120" cy="5627873"/>
+            <wp:docPr id="7" name="Picture 7"/>
             <wp:cNvGraphicFramePr>
               <a:graphicFrameLocks noChangeAspect="1"/>
             </wp:cNvGraphicFramePr>
@@ -6565,7 +6541,7 @@
                     <pic:cNvPicPr/>
                   </pic:nvPicPr>
                   <pic:blipFill>
-                    <a:blip r:embed="rId16"/>
+                    <a:blip r:embed="rId15"/>
                     <a:stretch>
                       <a:fillRect/>
                     </a:stretch>
@@ -6573,7 +6549,7 @@
                   <pic:spPr>
                     <a:xfrm>
                       <a:off x="0" y="0"/>
-                      <a:ext cx="4389120" cy="7831567"/>
+                      <a:ext cx="4389120" cy="5627873"/>
                     </a:xfrm>
                     <a:prstGeom prst="rect"/>
                   </pic:spPr>

</xml_diff>

<commit_message>
Bonding & Adventure Missions as Column G.
</commit_message>
<xml_diff>
--- a/research/TechPup-Product-Blueprint.docx
+++ b/research/TechPup-Product-Blueprint.docx
@@ -1818,6 +1818,985 @@
       <w:pPr>
         <w:spacing w:after="160"/>
       </w:pPr>
+    </w:p>
+    <w:p>
+      <w:pPr>
+        <w:spacing w:before="280" w:after="80"/>
+        <w:ind w:left="170"/>
+      </w:pPr>
+      <w:r>
+        <w:rPr>
+          <w:b/>
+          <w:color w:val="0F3460"/>
+          <w:sz w:val="20"/>
+        </w:rPr>
+        <w:t>Milestone 5: Bonding &amp; Adventure Missions</w:t>
+      </w:r>
+    </w:p>
+    <w:p>
+      <w:pPr>
+        <w:spacing w:before="240" w:after="60"/>
+      </w:pPr>
+      <w:r>
+        <w:rPr>
+          <w:b/>
+          <w:color w:val="166B8E"/>
+          <w:sz w:val="20"/>
+        </w:rPr>
+        <w:t>Duration</w:t>
+      </w:r>
+    </w:p>
+    <w:p>
+      <w:pPr>
+        <w:spacing w:before="160" w:after="40"/>
+      </w:pPr>
+      <w:r>
+        <w:rPr>
+          <w:color w:val="1A1A2E"/>
+          <w:sz w:val="20"/>
+        </w:rPr>
+        <w:t>Estimated 4-week content sprint: 2 weeks writing and tagging the mission pool, 1 week tuning archetype weights against playtest data, 1 week QA before rollout. (Estimate — adjust once content team capacity is confirmed.)</w:t>
+      </w:r>
+    </w:p>
+    <w:p>
+      <w:pPr>
+        <w:spacing w:before="240" w:after="60"/>
+      </w:pPr>
+      <w:r>
+        <w:rPr>
+          <w:b/>
+          <w:color w:val="166B8E"/>
+          <w:sz w:val="20"/>
+        </w:rPr>
+        <w:t>Objectives</w:t>
+      </w:r>
+    </w:p>
+    <w:p>
+      <w:pPr>
+        <w:spacing w:before="160" w:after="40"/>
+      </w:pPr>
+      <w:r>
+        <w:rPr>
+          <w:color w:val="1A1A2E"/>
+          <w:sz w:val="20"/>
+        </w:rPr>
+        <w:t>Create activities that strengthen the emotional connection between owner and dog. This expands the pool introduced in Daily Missions — Archetype-Specific Tasks with enough volume and variety to avoid repetition over months of daily use, while keeping every mission tuned to how active or passive a given archetype naturally is — an Adventurer and a Zen Dog should never feel like they're playing the same game.</w:t>
+      </w:r>
+    </w:p>
+    <w:p>
+      <w:pPr>
+        <w:spacing w:before="240" w:after="60"/>
+      </w:pPr>
+      <w:r>
+        <w:rPr>
+          <w:b/>
+          <w:color w:val="166B8E"/>
+          <w:sz w:val="20"/>
+        </w:rPr>
+        <w:t>Mission Categories</w:t>
+      </w:r>
+    </w:p>
+    <w:tbl>
+      <w:tblPr>
+        <w:tblStyle w:val="aff0"/>
+        <w:tblW w:type="auto" w:w="0"/>
+        <w:jc w:val="center"/>
+        <w:tblLook w:firstColumn="1" w:firstRow="1" w:lastColumn="0" w:lastRow="0" w:noHBand="0" w:noVBand="1" w:val="04A0"/>
+      </w:tblPr>
+      <w:tblGrid>
+        <w:gridCol w:w="2351"/>
+        <w:gridCol w:w="2351"/>
+        <w:gridCol w:w="2351"/>
+        <w:gridCol w:w="2351"/>
+      </w:tblGrid>
+      <w:tr>
+        <w:tc>
+          <w:tcPr>
+            <w:tcW w:type="dxa" w:w="1584"/>
+            <w:shd w:val="clear" w:color="auto" w:fill="0F3460"/>
+          </w:tcPr>
+          <w:p>
+            <w:r>
+              <w:rPr>
+                <w:b/>
+                <w:color w:val="FFFFFF"/>
+                <w:sz w:val="20"/>
+              </w:rPr>
+              <w:t>Category</w:t>
+            </w:r>
+          </w:p>
+        </w:tc>
+        <w:tc>
+          <w:tcPr>
+            <w:tcW w:type="dxa" w:w="1152"/>
+            <w:shd w:val="clear" w:color="auto" w:fill="0F3460"/>
+          </w:tcPr>
+          <w:p>
+            <w:r>
+              <w:rPr>
+                <w:b/>
+                <w:color w:val="FFFFFF"/>
+                <w:sz w:val="20"/>
+              </w:rPr>
+              <w:t>Pool Size</w:t>
+            </w:r>
+          </w:p>
+        </w:tc>
+        <w:tc>
+          <w:tcPr>
+            <w:tcW w:type="dxa" w:w="3600"/>
+            <w:shd w:val="clear" w:color="auto" w:fill="0F3460"/>
+          </w:tcPr>
+          <w:p>
+            <w:r>
+              <w:rPr>
+                <w:b/>
+                <w:color w:val="FFFFFF"/>
+                <w:sz w:val="20"/>
+              </w:rPr>
+              <w:t>Focus</w:t>
+            </w:r>
+          </w:p>
+        </w:tc>
+        <w:tc>
+          <w:tcPr>
+            <w:tcW w:type="dxa" w:w="4032"/>
+            <w:shd w:val="clear" w:color="auto" w:fill="0F3460"/>
+          </w:tcPr>
+          <w:p>
+            <w:r>
+              <w:rPr>
+                <w:b/>
+                <w:color w:val="FFFFFF"/>
+                <w:sz w:val="20"/>
+              </w:rPr>
+              <w:t>Example Missions</w:t>
+            </w:r>
+          </w:p>
+        </w:tc>
+      </w:tr>
+      <w:tr>
+        <w:tc>
+          <w:tcPr>
+            <w:tcW w:type="dxa" w:w="1584"/>
+            <w:shd w:val="clear" w:color="auto" w:fill="FFFFFF"/>
+          </w:tcPr>
+          <w:p>
+            <w:r>
+              <w:rPr>
+                <w:color w:val="1A1A2E"/>
+                <w:sz w:val="20"/>
+              </w:rPr>
+              <w:t>Bonding</w:t>
+            </w:r>
+          </w:p>
+        </w:tc>
+        <w:tc>
+          <w:tcPr>
+            <w:tcW w:type="dxa" w:w="1152"/>
+            <w:shd w:val="clear" w:color="auto" w:fill="FFFFFF"/>
+          </w:tcPr>
+          <w:p>
+            <w:r>
+              <w:rPr>
+                <w:color w:val="1A1A2E"/>
+                <w:sz w:val="20"/>
+              </w:rPr>
+              <w:t>150</w:t>
+            </w:r>
+          </w:p>
+        </w:tc>
+        <w:tc>
+          <w:tcPr>
+            <w:tcW w:type="dxa" w:w="3600"/>
+            <w:shd w:val="clear" w:color="auto" w:fill="FFFFFF"/>
+          </w:tcPr>
+          <w:p>
+            <w:r>
+              <w:rPr>
+                <w:color w:val="1A1A2E"/>
+                <w:sz w:val="20"/>
+              </w:rPr>
+              <w:t>Owner-dog connection; low-to-moderate physical intensity, high attention/affection focus.</w:t>
+            </w:r>
+          </w:p>
+        </w:tc>
+        <w:tc>
+          <w:tcPr>
+            <w:tcW w:type="dxa" w:w="4032"/>
+            <w:shd w:val="clear" w:color="auto" w:fill="FFFFFF"/>
+          </w:tcPr>
+          <w:p>
+            <w:r>
+              <w:rPr>
+                <w:color w:val="1A1A2E"/>
+                <w:sz w:val="20"/>
+              </w:rPr>
+              <w:t>10-minute grooming session with praise; eye-contact and name-response game; quiet co-presence time on the couch.</w:t>
+            </w:r>
+          </w:p>
+        </w:tc>
+      </w:tr>
+      <w:tr>
+        <w:tc>
+          <w:tcPr>
+            <w:tcW w:type="dxa" w:w="1584"/>
+            <w:shd w:val="clear" w:color="auto" w:fill="FFFFFF"/>
+          </w:tcPr>
+          <w:p>
+            <w:r>
+              <w:rPr>
+                <w:color w:val="1A1A2E"/>
+                <w:sz w:val="20"/>
+              </w:rPr>
+              <w:t>Adventure</w:t>
+            </w:r>
+          </w:p>
+        </w:tc>
+        <w:tc>
+          <w:tcPr>
+            <w:tcW w:type="dxa" w:w="1152"/>
+            <w:shd w:val="clear" w:color="auto" w:fill="FFFFFF"/>
+          </w:tcPr>
+          <w:p>
+            <w:r>
+              <w:rPr>
+                <w:color w:val="1A1A2E"/>
+                <w:sz w:val="20"/>
+              </w:rPr>
+              <w:t>100</w:t>
+            </w:r>
+          </w:p>
+        </w:tc>
+        <w:tc>
+          <w:tcPr>
+            <w:tcW w:type="dxa" w:w="3600"/>
+            <w:shd w:val="clear" w:color="auto" w:fill="FFFFFF"/>
+          </w:tcPr>
+          <w:p>
+            <w:r>
+              <w:rPr>
+                <w:color w:val="1A1A2E"/>
+                <w:sz w:val="20"/>
+              </w:rPr>
+              <w:t>Novelty-seeking, higher-intensity, outdoor exploration.</w:t>
+            </w:r>
+          </w:p>
+        </w:tc>
+        <w:tc>
+          <w:tcPr>
+            <w:tcW w:type="dxa" w:w="4032"/>
+            <w:shd w:val="clear" w:color="auto" w:fill="FFFFFF"/>
+          </w:tcPr>
+          <w:p>
+            <w:r>
+              <w:rPr>
+                <w:color w:val="1A1A2E"/>
+                <w:sz w:val="20"/>
+              </w:rPr>
+              <w:t>New trail hike; first visit to a new dog-friendly venue; off-leash sprint session where legal.</w:t>
+            </w:r>
+          </w:p>
+        </w:tc>
+      </w:tr>
+      <w:tr>
+        <w:tc>
+          <w:tcPr>
+            <w:tcW w:type="dxa" w:w="1584"/>
+            <w:shd w:val="clear" w:color="auto" w:fill="FFFFFF"/>
+          </w:tcPr>
+          <w:p>
+            <w:r>
+              <w:rPr>
+                <w:color w:val="1A1A2E"/>
+                <w:sz w:val="20"/>
+              </w:rPr>
+              <w:t>Wellness</w:t>
+            </w:r>
+          </w:p>
+        </w:tc>
+        <w:tc>
+          <w:tcPr>
+            <w:tcW w:type="dxa" w:w="1152"/>
+            <w:shd w:val="clear" w:color="auto" w:fill="FFFFFF"/>
+          </w:tcPr>
+          <w:p>
+            <w:r>
+              <w:rPr>
+                <w:color w:val="1A1A2E"/>
+                <w:sz w:val="20"/>
+              </w:rPr>
+              <w:t>50</w:t>
+            </w:r>
+          </w:p>
+        </w:tc>
+        <w:tc>
+          <w:tcPr>
+            <w:tcW w:type="dxa" w:w="3600"/>
+            <w:shd w:val="clear" w:color="auto" w:fill="FFFFFF"/>
+          </w:tcPr>
+          <w:p>
+            <w:r>
+              <w:rPr>
+                <w:color w:val="1A1A2E"/>
+                <w:sz w:val="20"/>
+              </w:rPr>
+              <w:t>Recovery and health-maintenance; weighted toward vet-flagged or aging dogs.</w:t>
+            </w:r>
+          </w:p>
+        </w:tc>
+        <w:tc>
+          <w:tcPr>
+            <w:tcW w:type="dxa" w:w="4032"/>
+            <w:shd w:val="clear" w:color="auto" w:fill="FFFFFF"/>
+          </w:tcPr>
+          <w:p>
+            <w:r>
+              <w:rPr>
+                <w:color w:val="1A1A2E"/>
+                <w:sz w:val="20"/>
+              </w:rPr>
+              <w:t>Post-walk stretch/cool-down routine; joint-friendly slow walk or swim; rest-day snuffle-mat enrichment.</w:t>
+            </w:r>
+          </w:p>
+        </w:tc>
+      </w:tr>
+    </w:tbl>
+    <w:p>
+      <w:pPr>
+        <w:spacing w:before="0" w:after="160"/>
+      </w:pPr>
+    </w:p>
+    <w:p>
+      <w:pPr>
+        <w:spacing w:before="240" w:after="60"/>
+      </w:pPr>
+      <w:r>
+        <w:rPr>
+          <w:b/>
+          <w:color w:val="166B8E"/>
+          <w:sz w:val="20"/>
+        </w:rPr>
+        <w:t>Archetype Weighting — Active vs. Passive Allocation</w:t>
+      </w:r>
+    </w:p>
+    <w:p>
+      <w:pPr>
+        <w:spacing w:before="160" w:after="40"/>
+      </w:pPr>
+      <w:r>
+        <w:rPr>
+          <w:color w:val="1A1A2E"/>
+          <w:sz w:val="20"/>
+        </w:rPr>
+        <w:t>Missions are not split evenly across archetypes. All 8 archetypes draw from the same shared 300-mission pool above, but each at a different ratio — an Adventurer's missions lean Adventure-heavy while a Zen Dog's lean Bonding/Wellness-heavy, using the archetype's established activity level (see Breed &amp; Personality Intelligence System, Section 4).</w:t>
+      </w:r>
+    </w:p>
+    <w:tbl>
+      <w:tblPr>
+        <w:tblStyle w:val="aff0"/>
+        <w:tblW w:type="auto" w:w="0"/>
+        <w:jc w:val="center"/>
+        <w:tblLook w:firstColumn="1" w:firstRow="1" w:lastColumn="0" w:lastRow="0" w:noHBand="0" w:noVBand="1" w:val="04A0"/>
+      </w:tblPr>
+      <w:tblGrid>
+        <w:gridCol w:w="2351"/>
+        <w:gridCol w:w="2351"/>
+        <w:gridCol w:w="2351"/>
+        <w:gridCol w:w="2351"/>
+      </w:tblGrid>
+      <w:tr>
+        <w:tc>
+          <w:tcPr>
+            <w:tcW w:type="dxa" w:w="2592"/>
+            <w:shd w:val="clear" w:color="auto" w:fill="0F3460"/>
+          </w:tcPr>
+          <w:p>
+            <w:r>
+              <w:rPr>
+                <w:b/>
+                <w:color w:val="FFFFFF"/>
+                <w:sz w:val="20"/>
+              </w:rPr>
+              <w:t>Archetype</w:t>
+            </w:r>
+          </w:p>
+        </w:tc>
+        <w:tc>
+          <w:tcPr>
+            <w:tcW w:type="dxa" w:w="2016"/>
+            <w:shd w:val="clear" w:color="auto" w:fill="0F3460"/>
+          </w:tcPr>
+          <w:p>
+            <w:r>
+              <w:rPr>
+                <w:b/>
+                <w:color w:val="FFFFFF"/>
+                <w:sz w:val="20"/>
+              </w:rPr>
+              <w:t>Bonding %</w:t>
+            </w:r>
+          </w:p>
+        </w:tc>
+        <w:tc>
+          <w:tcPr>
+            <w:tcW w:type="dxa" w:w="2016"/>
+            <w:shd w:val="clear" w:color="auto" w:fill="0F3460"/>
+          </w:tcPr>
+          <w:p>
+            <w:r>
+              <w:rPr>
+                <w:b/>
+                <w:color w:val="FFFFFF"/>
+                <w:sz w:val="20"/>
+              </w:rPr>
+              <w:t>Adventure %</w:t>
+            </w:r>
+          </w:p>
+        </w:tc>
+        <w:tc>
+          <w:tcPr>
+            <w:tcW w:type="dxa" w:w="2016"/>
+            <w:shd w:val="clear" w:color="auto" w:fill="0F3460"/>
+          </w:tcPr>
+          <w:p>
+            <w:r>
+              <w:rPr>
+                <w:b/>
+                <w:color w:val="FFFFFF"/>
+                <w:sz w:val="20"/>
+              </w:rPr>
+              <w:t>Wellness %</w:t>
+            </w:r>
+          </w:p>
+        </w:tc>
+      </w:tr>
+      <w:tr>
+        <w:tc>
+          <w:tcPr>
+            <w:tcW w:type="dxa" w:w="2592"/>
+            <w:shd w:val="clear" w:color="auto" w:fill="FFFFFF"/>
+          </w:tcPr>
+          <w:p>
+            <w:r>
+              <w:rPr>
+                <w:color w:val="1A1A2E"/>
+                <w:sz w:val="20"/>
+              </w:rPr>
+              <w:t>Adventurer</w:t>
+            </w:r>
+          </w:p>
+        </w:tc>
+        <w:tc>
+          <w:tcPr>
+            <w:tcW w:type="dxa" w:w="2016"/>
+            <w:shd w:val="clear" w:color="auto" w:fill="FFFFFF"/>
+          </w:tcPr>
+          <w:p>
+            <w:r>
+              <w:rPr>
+                <w:color w:val="1A1A2E"/>
+                <w:sz w:val="20"/>
+              </w:rPr>
+              <w:t>20%</w:t>
+            </w:r>
+          </w:p>
+        </w:tc>
+        <w:tc>
+          <w:tcPr>
+            <w:tcW w:type="dxa" w:w="2016"/>
+            <w:shd w:val="clear" w:color="auto" w:fill="FFFFFF"/>
+          </w:tcPr>
+          <w:p>
+            <w:r>
+              <w:rPr>
+                <w:color w:val="1A1A2E"/>
+                <w:sz w:val="20"/>
+              </w:rPr>
+              <w:t>65%</w:t>
+            </w:r>
+          </w:p>
+        </w:tc>
+        <w:tc>
+          <w:tcPr>
+            <w:tcW w:type="dxa" w:w="2016"/>
+            <w:shd w:val="clear" w:color="auto" w:fill="FFFFFF"/>
+          </w:tcPr>
+          <w:p>
+            <w:r>
+              <w:rPr>
+                <w:color w:val="1A1A2E"/>
+                <w:sz w:val="20"/>
+              </w:rPr>
+              <w:t>15%</w:t>
+            </w:r>
+          </w:p>
+        </w:tc>
+      </w:tr>
+      <w:tr>
+        <w:tc>
+          <w:tcPr>
+            <w:tcW w:type="dxa" w:w="2592"/>
+            <w:shd w:val="clear" w:color="auto" w:fill="FFFFFF"/>
+          </w:tcPr>
+          <w:p>
+            <w:r>
+              <w:rPr>
+                <w:color w:val="1A1A2E"/>
+                <w:sz w:val="20"/>
+              </w:rPr>
+              <w:t>Athlete</w:t>
+            </w:r>
+          </w:p>
+        </w:tc>
+        <w:tc>
+          <w:tcPr>
+            <w:tcW w:type="dxa" w:w="2016"/>
+            <w:shd w:val="clear" w:color="auto" w:fill="FFFFFF"/>
+          </w:tcPr>
+          <w:p>
+            <w:r>
+              <w:rPr>
+                <w:color w:val="1A1A2E"/>
+                <w:sz w:val="20"/>
+              </w:rPr>
+              <w:t>20%</w:t>
+            </w:r>
+          </w:p>
+        </w:tc>
+        <w:tc>
+          <w:tcPr>
+            <w:tcW w:type="dxa" w:w="2016"/>
+            <w:shd w:val="clear" w:color="auto" w:fill="FFFFFF"/>
+          </w:tcPr>
+          <w:p>
+            <w:r>
+              <w:rPr>
+                <w:color w:val="1A1A2E"/>
+                <w:sz w:val="20"/>
+              </w:rPr>
+              <w:t>60%</w:t>
+            </w:r>
+          </w:p>
+        </w:tc>
+        <w:tc>
+          <w:tcPr>
+            <w:tcW w:type="dxa" w:w="2016"/>
+            <w:shd w:val="clear" w:color="auto" w:fill="FFFFFF"/>
+          </w:tcPr>
+          <w:p>
+            <w:r>
+              <w:rPr>
+                <w:color w:val="1A1A2E"/>
+                <w:sz w:val="20"/>
+              </w:rPr>
+              <w:t>20%</w:t>
+            </w:r>
+          </w:p>
+        </w:tc>
+      </w:tr>
+      <w:tr>
+        <w:tc>
+          <w:tcPr>
+            <w:tcW w:type="dxa" w:w="2592"/>
+            <w:shd w:val="clear" w:color="auto" w:fill="FFFFFF"/>
+          </w:tcPr>
+          <w:p>
+            <w:r>
+              <w:rPr>
+                <w:color w:val="1A1A2E"/>
+                <w:sz w:val="20"/>
+              </w:rPr>
+              <w:t>Explorer</w:t>
+            </w:r>
+          </w:p>
+        </w:tc>
+        <w:tc>
+          <w:tcPr>
+            <w:tcW w:type="dxa" w:w="2016"/>
+            <w:shd w:val="clear" w:color="auto" w:fill="FFFFFF"/>
+          </w:tcPr>
+          <w:p>
+            <w:r>
+              <w:rPr>
+                <w:color w:val="1A1A2E"/>
+                <w:sz w:val="20"/>
+              </w:rPr>
+              <w:t>30%</w:t>
+            </w:r>
+          </w:p>
+        </w:tc>
+        <w:tc>
+          <w:tcPr>
+            <w:tcW w:type="dxa" w:w="2016"/>
+            <w:shd w:val="clear" w:color="auto" w:fill="FFFFFF"/>
+          </w:tcPr>
+          <w:p>
+            <w:r>
+              <w:rPr>
+                <w:color w:val="1A1A2E"/>
+                <w:sz w:val="20"/>
+              </w:rPr>
+              <w:t>55%</w:t>
+            </w:r>
+          </w:p>
+        </w:tc>
+        <w:tc>
+          <w:tcPr>
+            <w:tcW w:type="dxa" w:w="2016"/>
+            <w:shd w:val="clear" w:color="auto" w:fill="FFFFFF"/>
+          </w:tcPr>
+          <w:p>
+            <w:r>
+              <w:rPr>
+                <w:color w:val="1A1A2E"/>
+                <w:sz w:val="20"/>
+              </w:rPr>
+              <w:t>15%</w:t>
+            </w:r>
+          </w:p>
+        </w:tc>
+      </w:tr>
+      <w:tr>
+        <w:tc>
+          <w:tcPr>
+            <w:tcW w:type="dxa" w:w="2592"/>
+            <w:shd w:val="clear" w:color="auto" w:fill="FFFFFF"/>
+          </w:tcPr>
+          <w:p>
+            <w:r>
+              <w:rPr>
+                <w:color w:val="1A1A2E"/>
+                <w:sz w:val="20"/>
+              </w:rPr>
+              <w:t>Genius</w:t>
+            </w:r>
+          </w:p>
+        </w:tc>
+        <w:tc>
+          <w:tcPr>
+            <w:tcW w:type="dxa" w:w="2016"/>
+            <w:shd w:val="clear" w:color="auto" w:fill="FFFFFF"/>
+          </w:tcPr>
+          <w:p>
+            <w:r>
+              <w:rPr>
+                <w:color w:val="1A1A2E"/>
+                <w:sz w:val="20"/>
+              </w:rPr>
+              <w:t>50%</w:t>
+            </w:r>
+          </w:p>
+        </w:tc>
+        <w:tc>
+          <w:tcPr>
+            <w:tcW w:type="dxa" w:w="2016"/>
+            <w:shd w:val="clear" w:color="auto" w:fill="FFFFFF"/>
+          </w:tcPr>
+          <w:p>
+            <w:r>
+              <w:rPr>
+                <w:color w:val="1A1A2E"/>
+                <w:sz w:val="20"/>
+              </w:rPr>
+              <w:t>25%</w:t>
+            </w:r>
+          </w:p>
+        </w:tc>
+        <w:tc>
+          <w:tcPr>
+            <w:tcW w:type="dxa" w:w="2016"/>
+            <w:shd w:val="clear" w:color="auto" w:fill="FFFFFF"/>
+          </w:tcPr>
+          <w:p>
+            <w:r>
+              <w:rPr>
+                <w:color w:val="1A1A2E"/>
+                <w:sz w:val="20"/>
+              </w:rPr>
+              <w:t>25%</w:t>
+            </w:r>
+          </w:p>
+        </w:tc>
+      </w:tr>
+      <w:tr>
+        <w:tc>
+          <w:tcPr>
+            <w:tcW w:type="dxa" w:w="2592"/>
+            <w:shd w:val="clear" w:color="auto" w:fill="FFFFFF"/>
+          </w:tcPr>
+          <w:p>
+            <w:r>
+              <w:rPr>
+                <w:color w:val="1A1A2E"/>
+                <w:sz w:val="20"/>
+              </w:rPr>
+              <w:t>Foodie</w:t>
+            </w:r>
+          </w:p>
+        </w:tc>
+        <w:tc>
+          <w:tcPr>
+            <w:tcW w:type="dxa" w:w="2016"/>
+            <w:shd w:val="clear" w:color="auto" w:fill="FFFFFF"/>
+          </w:tcPr>
+          <w:p>
+            <w:r>
+              <w:rPr>
+                <w:color w:val="1A1A2E"/>
+                <w:sz w:val="20"/>
+              </w:rPr>
+              <w:t>45%</w:t>
+            </w:r>
+          </w:p>
+        </w:tc>
+        <w:tc>
+          <w:tcPr>
+            <w:tcW w:type="dxa" w:w="2016"/>
+            <w:shd w:val="clear" w:color="auto" w:fill="FFFFFF"/>
+          </w:tcPr>
+          <w:p>
+            <w:r>
+              <w:rPr>
+                <w:color w:val="1A1A2E"/>
+                <w:sz w:val="20"/>
+              </w:rPr>
+              <w:t>25%</w:t>
+            </w:r>
+          </w:p>
+        </w:tc>
+        <w:tc>
+          <w:tcPr>
+            <w:tcW w:type="dxa" w:w="2016"/>
+            <w:shd w:val="clear" w:color="auto" w:fill="FFFFFF"/>
+          </w:tcPr>
+          <w:p>
+            <w:r>
+              <w:rPr>
+                <w:color w:val="1A1A2E"/>
+                <w:sz w:val="20"/>
+              </w:rPr>
+              <w:t>30%</w:t>
+            </w:r>
+          </w:p>
+        </w:tc>
+      </w:tr>
+      <w:tr>
+        <w:tc>
+          <w:tcPr>
+            <w:tcW w:type="dxa" w:w="2592"/>
+            <w:shd w:val="clear" w:color="auto" w:fill="FFFFFF"/>
+          </w:tcPr>
+          <w:p>
+            <w:r>
+              <w:rPr>
+                <w:color w:val="1A1A2E"/>
+                <w:sz w:val="20"/>
+              </w:rPr>
+              <w:t>Social Butterfly</w:t>
+            </w:r>
+          </w:p>
+        </w:tc>
+        <w:tc>
+          <w:tcPr>
+            <w:tcW w:type="dxa" w:w="2016"/>
+            <w:shd w:val="clear" w:color="auto" w:fill="FFFFFF"/>
+          </w:tcPr>
+          <w:p>
+            <w:r>
+              <w:rPr>
+                <w:color w:val="1A1A2E"/>
+                <w:sz w:val="20"/>
+              </w:rPr>
+              <w:t>60%</w:t>
+            </w:r>
+          </w:p>
+        </w:tc>
+        <w:tc>
+          <w:tcPr>
+            <w:tcW w:type="dxa" w:w="2016"/>
+            <w:shd w:val="clear" w:color="auto" w:fill="FFFFFF"/>
+          </w:tcPr>
+          <w:p>
+            <w:r>
+              <w:rPr>
+                <w:color w:val="1A1A2E"/>
+                <w:sz w:val="20"/>
+              </w:rPr>
+              <w:t>25%</w:t>
+            </w:r>
+          </w:p>
+        </w:tc>
+        <w:tc>
+          <w:tcPr>
+            <w:tcW w:type="dxa" w:w="2016"/>
+            <w:shd w:val="clear" w:color="auto" w:fill="FFFFFF"/>
+          </w:tcPr>
+          <w:p>
+            <w:r>
+              <w:rPr>
+                <w:color w:val="1A1A2E"/>
+                <w:sz w:val="20"/>
+              </w:rPr>
+              <w:t>15%</w:t>
+            </w:r>
+          </w:p>
+        </w:tc>
+      </w:tr>
+      <w:tr>
+        <w:tc>
+          <w:tcPr>
+            <w:tcW w:type="dxa" w:w="2592"/>
+            <w:shd w:val="clear" w:color="auto" w:fill="FFFFFF"/>
+          </w:tcPr>
+          <w:p>
+            <w:r>
+              <w:rPr>
+                <w:color w:val="1A1A2E"/>
+                <w:sz w:val="20"/>
+              </w:rPr>
+              <w:t>Guardian</w:t>
+            </w:r>
+          </w:p>
+        </w:tc>
+        <w:tc>
+          <w:tcPr>
+            <w:tcW w:type="dxa" w:w="2016"/>
+            <w:shd w:val="clear" w:color="auto" w:fill="FFFFFF"/>
+          </w:tcPr>
+          <w:p>
+            <w:r>
+              <w:rPr>
+                <w:color w:val="1A1A2E"/>
+                <w:sz w:val="20"/>
+              </w:rPr>
+              <w:t>55%</w:t>
+            </w:r>
+          </w:p>
+        </w:tc>
+        <w:tc>
+          <w:tcPr>
+            <w:tcW w:type="dxa" w:w="2016"/>
+            <w:shd w:val="clear" w:color="auto" w:fill="FFFFFF"/>
+          </w:tcPr>
+          <w:p>
+            <w:r>
+              <w:rPr>
+                <w:color w:val="1A1A2E"/>
+                <w:sz w:val="20"/>
+              </w:rPr>
+              <w:t>20%</w:t>
+            </w:r>
+          </w:p>
+        </w:tc>
+        <w:tc>
+          <w:tcPr>
+            <w:tcW w:type="dxa" w:w="2016"/>
+            <w:shd w:val="clear" w:color="auto" w:fill="FFFFFF"/>
+          </w:tcPr>
+          <w:p>
+            <w:r>
+              <w:rPr>
+                <w:color w:val="1A1A2E"/>
+                <w:sz w:val="20"/>
+              </w:rPr>
+              <w:t>25%</w:t>
+            </w:r>
+          </w:p>
+        </w:tc>
+      </w:tr>
+      <w:tr>
+        <w:tc>
+          <w:tcPr>
+            <w:tcW w:type="dxa" w:w="2592"/>
+            <w:shd w:val="clear" w:color="auto" w:fill="FFFFFF"/>
+          </w:tcPr>
+          <w:p>
+            <w:r>
+              <w:rPr>
+                <w:color w:val="1A1A2E"/>
+                <w:sz w:val="20"/>
+              </w:rPr>
+              <w:t>Zen Dog</w:t>
+            </w:r>
+          </w:p>
+        </w:tc>
+        <w:tc>
+          <w:tcPr>
+            <w:tcW w:type="dxa" w:w="2016"/>
+            <w:shd w:val="clear" w:color="auto" w:fill="FFFFFF"/>
+          </w:tcPr>
+          <w:p>
+            <w:r>
+              <w:rPr>
+                <w:color w:val="1A1A2E"/>
+                <w:sz w:val="20"/>
+              </w:rPr>
+              <w:t>45%</w:t>
+            </w:r>
+          </w:p>
+        </w:tc>
+        <w:tc>
+          <w:tcPr>
+            <w:tcW w:type="dxa" w:w="2016"/>
+            <w:shd w:val="clear" w:color="auto" w:fill="FFFFFF"/>
+          </w:tcPr>
+          <w:p>
+            <w:r>
+              <w:rPr>
+                <w:color w:val="1A1A2E"/>
+                <w:sz w:val="20"/>
+              </w:rPr>
+              <w:t>10%</w:t>
+            </w:r>
+          </w:p>
+        </w:tc>
+        <w:tc>
+          <w:tcPr>
+            <w:tcW w:type="dxa" w:w="2016"/>
+            <w:shd w:val="clear" w:color="auto" w:fill="FFFFFF"/>
+          </w:tcPr>
+          <w:p>
+            <w:r>
+              <w:rPr>
+                <w:color w:val="1A1A2E"/>
+                <w:sz w:val="20"/>
+              </w:rPr>
+              <w:t>45%</w:t>
+            </w:r>
+          </w:p>
+        </w:tc>
+      </w:tr>
+    </w:tbl>
+    <w:p>
+      <w:pPr>
+        <w:spacing w:before="0" w:after="160"/>
+      </w:pPr>
+    </w:p>
+    <w:p>
+      <w:pPr>
+        <w:spacing w:before="240" w:after="60"/>
+      </w:pPr>
+      <w:r>
+        <w:rPr>
+          <w:b/>
+          <w:color w:val="166B8E"/>
+          <w:sz w:val="20"/>
+        </w:rPr>
+        <w:t>Mission Tagging System</w:t>
+      </w:r>
+    </w:p>
+    <w:p>
+      <w:pPr>
+        <w:spacing w:before="160" w:after="40"/>
+      </w:pPr>
+      <w:r>
+        <w:rPr>
+          <w:color w:val="1A1A2E"/>
+          <w:sz w:val="20"/>
+        </w:rPr>
+        <w:t>Each mission in the 300-item pool is authored once and tagged with: Category (Bonding / Adventure / Wellness), Intensity (Active / Moderate / Passive), Target Archetypes (which of the 8 it fits), and Duration. The mission engine (Mission Recommendation Logic, Section 6) filters this tagged pool by the dog's archetype weighting above, current mood tier, and breed activity target — the same selection logic already used for daily missions, just drawing from a larger, taggable pool instead of a fixed per-archetype list.</w:t>
+      </w:r>
     </w:p>
     <w:p>
       <w:pPr>

</xml_diff>